<commit_message>
Rename DA3 to Lab Assignment 5 across project
</commit_message>
<xml_diff>
--- a/DBMS_Project_Report.docx
+++ b/DBMS_Project_Report.docx
@@ -19,7 +19,7 @@
         <w:rPr>
           <w:sz w:val="32"/>
         </w:rPr>
-        <w:t>DA-3 Project Report</w:t>
+        <w:t>Lab Assignment 5 Project Report</w:t>
         <w:br/>
         <w:t>Dynamic Web Application with Java, JDBC, and Oracle Database</w:t>
       </w:r>
@@ -34,7 +34,7 @@
         <w:jc w:val="center"/>
       </w:pPr>
       <w:r>
-        <w:t>GitHub Repository: https://github.com/AviDhandhania/dbms-da3</w:t>
+        <w:t>GitHub Repository: https://github.com/AviDhandhania/dbms-lab-assignment-5</w:t>
       </w:r>
     </w:p>
     <w:p/>

</xml_diff>